<commit_message>
feat: checkpoint de design patterns com Strategy e ADR-001
- ADR-001: adota Strategy na validação das respostas do checklist por tipo de norma
- novo diagrama de sequência do cenário que passa pelo condicional
- CP 2 atualizado com os cinco itens do checkpoint
- readme com o resultado do checkpoint e lista de arquivos
- Risk_Solutions: correção de "glosa", papel Administrador, Frontend/Worker e histórico de versões
- notebook: Strategy com política injetada no pedido e correções de texto
- adiciona .gitignore
</commit_message>
<xml_diff>
--- a/CP 2 SOFTWARE ENGINEERING.docx
+++ b/CP 2 SOFTWARE ENGINEERING.docx
@@ -48,6 +48,31 @@
       <w:pPr>
         <w:jc w:val="both"/>
       </w:pPr>
+    </w:p>
+    <w:p>
+      <w:pPr>
+        <w:keepNext/>
+        <w:spacing w:before="120" w:after="80"/>
+        <w:jc w:val="both"/>
+      </w:pPr>
+      <w:r>
+        <w:rPr>
+          <w:b/>
+        </w:rPr>
+        <w:t>1. Maior condicional</w:t>
+      </w:r>
+    </w:p>
+    <w:p>
+      <w:pPr>
+        <w:spacing w:before="0" w:after="80"/>
+        <w:jc w:val="both"/>
+      </w:pPr>
+      <w:r>
+        <w:rPr>
+          <w:b w:val="0"/>
+        </w:rPr>
+        <w:t>O maior condicional do projeto está na validação das respostas do checklist contra as normas da apólice. Cada norma é de um tipo (sim/não, valor com limite ou data) e a resposta do vistoriador é avaliada de um jeito diferente conforme esse tipo. O projeto ainda não tem código, então esse é o condicional que a implementação produziria por padrão: um switch sobre o tipo da norma dentro da CalculadoraRisco. No diagrama abaixo, as mensagens 4, 5 e 6 são os ramos desse condicional.</w:t>
+      </w:r>
     </w:p>
     <w:p>
       <w:pPr>
@@ -66,10 +91,10 @@
             <wp:positionV relativeFrom="paragraph">
               <wp:posOffset>316230</wp:posOffset>
             </wp:positionV>
-            <wp:extent cx="6845076" cy="5379720"/>
+            <wp:extent cx="6480000" cy="3982598"/>
             <wp:effectExtent l="0" t="0" r="0" b="0"/>
             <wp:wrapTopAndBottom/>
-            <wp:docPr id="581584137" name="Imagem 1"/>
+            <wp:docPr id="581584137" name="Imagem 1" descr="Diagrama de sequência: envio das respostas da vistoria passando pelo condicional de validação por tipo de norma"/>
             <wp:cNvGraphicFramePr>
               <a:graphicFrameLocks xmlns:a="http://schemas.openxmlformats.org/drawingml/2006/main" noChangeAspect="1"/>
             </wp:cNvGraphicFramePr>
@@ -98,7 +123,7 @@
                   <pic:spPr bwMode="auto">
                     <a:xfrm>
                       <a:off x="0" y="0"/>
-                      <a:ext cx="6845076" cy="5379720"/>
+                      <a:ext cx="6480000" cy="3982598"/>
                     </a:xfrm>
                     <a:prstGeom prst="rect">
                       <a:avLst/>
@@ -121,50 +146,97 @@
         </w:drawing>
       </w:r>
       <w:r>
-        <w:t xml:space="preserve">Diagrama de Sequência </w:t>
+        <w:rPr>
+          <w:b/>
+        </w:rPr>
+        <w:t>2. Diagrama de sequência</w:t>
       </w:r>
     </w:p>
     <w:p>
       <w:pPr>
+        <w:keepNext/>
+        <w:spacing w:before="120" w:after="80"/>
         <w:jc w:val="both"/>
+      </w:pPr>
+      <w:r>
         <w:rPr>
           <w:b/>
-          <w:bCs/>
         </w:rPr>
-      </w:pPr>
+        <w:t>3. Variação que um padrão absorveria</w:t>
+      </w:r>
     </w:p>
     <w:p>
       <w:pPr>
+        <w:spacing w:before="0" w:after="80"/>
         <w:jc w:val="both"/>
       </w:pPr>
       <w:r>
-        <w:t>A escolha atual</w:t>
-      </w:r>
-      <w:r>
-        <w:t xml:space="preserve"> do padrão</w:t>
-      </w:r>
-      <w:r>
-        <w:t xml:space="preserve"> é "Nenhum ainda", pois o diagrama não expõe ramificações ou decisões por tipo; </w:t>
-      </w:r>
-      <w:r>
-        <w:t>c</w:t>
-      </w:r>
-      <w:r>
-        <w:t xml:space="preserve">ontudo, assim que o switch das diferentes lógicas de validação de normas (sim/não, datas, limites) crescer, </w:t>
-      </w:r>
-      <w:r>
-        <w:t xml:space="preserve">acredito que a melhor escolha seja </w:t>
-      </w:r>
-      <w:r>
-        <w:t xml:space="preserve">o padrão </w:t>
-      </w:r>
-      <w:proofErr w:type="spellStart"/>
-      <w:r>
-        <w:t>Strategy</w:t>
-      </w:r>
-      <w:proofErr w:type="spellEnd"/>
-      <w:r>
-        <w:t xml:space="preserve"> para absorver essa variação de regras.</w:t>
+        <w:rPr>
+          <w:b w:val="0"/>
+        </w:rPr>
+        <w:t>A regra de validação que muda conforme o tipo da norma (sim/não, valor com limite, data).</w:t>
+      </w:r>
+    </w:p>
+    <w:p>
+      <w:pPr>
+        <w:keepNext/>
+        <w:spacing w:before="120" w:after="80"/>
+        <w:jc w:val="both"/>
+      </w:pPr>
+      <w:r>
+        <w:rPr>
+          <w:b/>
+        </w:rPr>
+        <w:t>4. Padrão escolhido: Strategy</w:t>
+      </w:r>
+    </w:p>
+    <w:p>
+      <w:pPr>
+        <w:spacing w:before="0" w:after="80"/>
+        <w:jc w:val="both"/>
+      </w:pPr>
+      <w:r>
+        <w:rPr>
+          <w:b w:val="0"/>
+        </w:rPr>
+        <w:t>Cada tipo de norma ganha uma classe validadora com o mesmo método validar(resposta, norma), e a CalculadoraRisco escolhe o validador pelo tipo da norma sem saber qual regra está aplicando. Um tipo novo de norma vira uma classe nova, sem editar a lógica do cálculo de risco, o que atende o Risco 2 do documento de visão (mudanças abruptas nas regras da seguradora). Se aparecer um tipo sem validador, o cálculo falha com erro explícito em vez de assumir um resultado.</w:t>
+      </w:r>
+    </w:p>
+    <w:p>
+      <w:pPr>
+        <w:spacing w:before="0" w:after="80"/>
+        <w:jc w:val="both"/>
+      </w:pPr>
+      <w:r>
+        <w:rPr>
+          <w:b w:val="0"/>
+        </w:rPr>
+        <w:t>Na versão anterior deste checkpoint tínhamos escolhido "nenhum ainda". Revisamos a decisão porque o diagrama atual já passa pelo condicional e porque as normas, pela premissa do projeto, vêm em formatos lógicos que tendem a crescer. Factory Method, Observer, Adapter e Decorator foram considerados e descartados; os motivos estão no ADR.</w:t>
+      </w:r>
+    </w:p>
+    <w:p>
+      <w:pPr>
+        <w:keepNext/>
+        <w:spacing w:before="120" w:after="80"/>
+        <w:jc w:val="both"/>
+      </w:pPr>
+      <w:r>
+        <w:rPr>
+          <w:b/>
+        </w:rPr>
+        <w:t>5. Registro da decisão</w:t>
+      </w:r>
+    </w:p>
+    <w:p>
+      <w:pPr>
+        <w:spacing w:before="0" w:after="80"/>
+        <w:jc w:val="both"/>
+      </w:pPr>
+      <w:r>
+        <w:rPr>
+          <w:b w:val="0"/>
+        </w:rPr>
+        <w:t>ADR-001, em docs/adr/0001-strategy-validacao-normas.md no repositório do grupo: contexto, decisão, alternativas descartadas, consequências e quando revisar.</w:t>
       </w:r>
     </w:p>
     <w:sectPr>

</xml_diff>